<commit_message>
Max Weber & Macht
</commit_message>
<xml_diff>
--- a/WIP/The Nexus of Power Culture and Elite Interactions a Neoclassical Realist Framework for Foreign Policy Analysis Haluk Dogan.docx
+++ b/WIP/The Nexus of Power Culture and Elite Interactions a Neoclassical Realist Framework for Foreign Policy Analysis Haluk Dogan.docx
@@ -36,21 +36,7 @@
           <w:u w:val="single"/>
           <w:lang w:val="en-US"/>
         </w:rPr>
-        <w:t>Haluk DOĞAN</w:t>
-      </w:r>
-      <w:r>
-        <w:rPr>
-          <w:u w:val="single"/>
-          <w:lang w:val="en-US"/>
-        </w:rPr>
-        <w:t xml:space="preserve"> - </w:t>
-      </w:r>
-      <w:r>
-        <w:rPr>
-          <w:u w:val="single"/>
-          <w:lang w:val="en-US"/>
-        </w:rPr>
-        <w:t>The Nexus of Power, Culture, and Elite Interactions: A Neoclassical Realist Framework for Foreign Policy Analysis</w:t>
+        <w:t>Haluk DOĞAN - The Nexus of Power, Culture, and Elite Interactions: A Neoclassical Realist Framework for Foreign Policy Analysis</w:t>
       </w:r>
     </w:p>
     <w:p>
@@ -354,7 +340,19 @@
         <w:rPr>
           <w:lang w:val="en-US"/>
         </w:rPr>
-        <w:t>(random thought: Maybe the international policy should be as much detached from internal policies as possible? Maybe it should not be influenced by any type of ideology? But it is. Can we represent this pectrum somehow?</w:t>
+        <w:t xml:space="preserve">(random thought: Maybe the international policy should be as much detached from internal policies as possible? Maybe it should not be influenced by any type of ideology? But it is. Can we represent this </w:t>
+      </w:r>
+      <w:r>
+        <w:rPr>
+          <w:lang w:val="en-US"/>
+        </w:rPr>
+        <w:t>s</w:t>
+      </w:r>
+      <w:r>
+        <w:rPr>
+          <w:lang w:val="en-US"/>
+        </w:rPr>
+        <w:t>pectrum somehow?</w:t>
       </w:r>
       <w:r>
         <w:rPr>

</xml_diff>